<commit_message>
Chromebook-versie voor de studie: app Bestanden, 2 vingers, filmpjes bij stap 4 en 5
De leerlingen maken de taak in de studie, alleen op een Chromebook.
- Stap 3: uitpakken in de app Bestanden (2 vingers › Alles uitpakken) en
  met Ctrl + C / Ctrl + V naar Google Drive › Mijn Drive › NovaDepot.
- Stap 4: Naam wijzigen selecteert de hele naam, ook .docx: typ .docx er
  opnieuw achter. Met een filmpje van 12 seconden.
- Stap 5: Verplaatsen opent op "Voorgesteld"; klik naast Huidige locatie
  op NovaDepot. Met een filmpje.
- Dia's, lesvoorbereiding, lesfiche, README en werkdocument (extra a/b)
  volgen de Chromebook-werkwijze; meta toestel=chromebook voor de controle.

Co-Authored-By: Claude Opus 5.5 <noreply@anthropic.com>
</commit_message>
<xml_diff>
--- a/werkdocument/WP1_Mijn-NovaDepot-map.docx
+++ b/werkdocument/WP1_Mijn-NovaDepot-map.docx
@@ -922,7 +922,7 @@
           <w:i w:val="0"/>
           <w:sz w:val="22"/>
         </w:rPr>
-        <w:t>a) Geef je map NovaDepot een kleur: rechtsklik › Ordenen › Kleur van map.</w:t>
+        <w:t>a) Geef je map NovaDepot een kleur: klik met 2 vingers op de map › Ordenen › Kleur van map.</w:t>
       </w:r>
     </w:p>
     <w:p>
@@ -936,7 +936,7 @@
           <w:i w:val="0"/>
           <w:sz w:val="22"/>
         </w:rPr>
-        <w:t>b) Zet een ster bij je map: rechtsklik › Ordenen › Toevoegen aan Met ster.</w:t>
+        <w:t>b) Zet een ster bij je map: klik met 2 vingers op de map › Ordenen › Toevoegen aan Met ster.</w:t>
       </w:r>
     </w:p>
     <w:sectPr>

</xml_diff>